<commit_message>
docs(fase-2): informe final 2.6 actualizado al 28-10 (borrador)
Pone al día las versiones en español e inglés con el ADR-026 (aplicación
web mobile first), el ADR-027 (precios exactos y un solo cobro), el
estado de los objetivos 3 a 7 al 28-10, el trabajo con seis agentes, la
investigación normativa, la privacidad del relevo (MATU-09) y la demo
del 30-10. Lo pendiente sigue en amarillo.

Co-Authored-By: Claude Opus 5.5 <noreply@anthropic.com>
</commit_message>
<xml_diff>
--- a/Fase 2/Evidencias Grupales/2.6_GuiaEstudiante_Fase 2_Informe Final Proyecto APT(Español).docx
+++ b/Fase 2/Evidencias Grupales/2.6_GuiaEstudiante_Fase 2_Informe Final Proyecto APT(Español).docx
@@ -412,7 +412,7 @@
           <w:sz w:val="20"/>
           <w:highlight w:val="yellow"/>
         </w:rPr>
-        <w:t>BORRADOR al 13 de octubre de 2026. Este informe se completa al cierre del sprint 5 (19 de noviembre) para la entrega final de la semana 15. Lo marcado en amarillo depende del desarrollo que todavía no ocurre.</w:t>
+        <w:t>BORRADOR actualizado al 28 de octubre de 2026. Este informe se completa al cierre del sprint 5 (19 de noviembre) para la entrega final de la semana 15. Lo marcado en amarillo depende del desarrollo que viene.</w:t>
       </w:r>
     </w:p>
     <w:tbl>
@@ -1390,12 +1390,21 @@
             <w:r>
               <w:rPr>
                 <w:rFonts w:ascii="Calibri" w:hAnsi="Calibri" w:eastAsia="Calibri"/>
-                <w:b/>
                 <w:color w:val="1A1A1A"/>
                 <w:sz w:val="18"/>
                 <w:highlight w:val="yellow"/>
               </w:rPr>
-              <w:t>[Estado final]</w:t>
+              <w:t xml:space="preserve">Estado al 28-10: contrato de API acordado (MATU-09) y diseño de pantallas listo. La implementación tiene su cierre previsto el 30 de octubre. </w:t>
+            </w:r>
+            <w:r>
+              <w:rPr>
+                <w:rFonts w:ascii="Calibri" w:hAnsi="Calibri" w:eastAsia="Calibri"/>
+                <w:b/>
+                <w:color w:val="1A1A1A"/>
+                <w:sz w:val="18"/>
+                <w:highlight w:val="yellow"/>
+              </w:rPr>
+              <w:t xml:space="preserve">[Estado final]</w:t>
             </w:r>
           </w:p>
           <w:p>
@@ -1416,12 +1425,21 @@
             <w:r>
               <w:rPr>
                 <w:rFonts w:ascii="Calibri" w:hAnsi="Calibri" w:eastAsia="Calibri"/>
-                <w:b/>
                 <w:color w:val="1A1A1A"/>
                 <w:sz w:val="18"/>
                 <w:highlight w:val="yellow"/>
               </w:rPr>
-              <w:t>[Estado final]</w:t>
+              <w:t xml:space="preserve">Estado al 28-10: planificado para el sprint 3, del 30 de octubre al 5 de noviembre. </w:t>
+            </w:r>
+            <w:r>
+              <w:rPr>
+                <w:rFonts w:ascii="Calibri" w:hAnsi="Calibri" w:eastAsia="Calibri"/>
+                <w:b/>
+                <w:color w:val="1A1A1A"/>
+                <w:sz w:val="18"/>
+                <w:highlight w:val="yellow"/>
+              </w:rPr>
+              <w:t xml:space="preserve">[Estado final]</w:t>
             </w:r>
           </w:p>
           <w:p>
@@ -1442,12 +1460,21 @@
             <w:r>
               <w:rPr>
                 <w:rFonts w:ascii="Calibri" w:hAnsi="Calibri" w:eastAsia="Calibri"/>
-                <w:b/>
                 <w:color w:val="1A1A1A"/>
                 <w:sz w:val="18"/>
                 <w:highlight w:val="yellow"/>
               </w:rPr>
-              <w:t>[Estado final]</w:t>
+              <w:t xml:space="preserve">Estado al 28-10: planificado para el sprint 4, del 6 al 12 de noviembre. </w:t>
+            </w:r>
+            <w:r>
+              <w:rPr>
+                <w:rFonts w:ascii="Calibri" w:hAnsi="Calibri" w:eastAsia="Calibri"/>
+                <w:b/>
+                <w:color w:val="1A1A1A"/>
+                <w:sz w:val="18"/>
+                <w:highlight w:val="yellow"/>
+              </w:rPr>
+              <w:t xml:space="preserve">[Estado final]</w:t>
             </w:r>
           </w:p>
           <w:p>
@@ -1463,17 +1490,26 @@
                 <w:color w:val="1A1A1A"/>
                 <w:sz w:val="18"/>
               </w:rPr>
-              <w:t xml:space="preserve">6. Construir el flujo de pedido con autorización diferida y captura por el monto real, con los siete casos obligatorios del flujo de pago en verde, al 12 de noviembre. </w:t>
-            </w:r>
-            <w:r>
-              <w:rPr>
-                <w:rFonts w:ascii="Calibri" w:hAnsi="Calibri" w:eastAsia="Calibri"/>
-                <w:b/>
+              <w:t xml:space="preserve">6. Construir el flujo de pedido con cobro único del total confirmado (ADR-027), con los nueve casos obligatorios del flujo de pago en verde, al 12 de noviembre. Este objetivo cambió el 26 de octubre. Antes decía autorización diferida y captura por el monto real, pero la prueba de concepto de Transbank mostró que la captura diferida no admite débito. Con un solo cobro, además, la familia ve el monto exacto antes de pagar. </w:t>
+            </w:r>
+            <w:r>
+              <w:rPr>
+                <w:rFonts w:ascii="Calibri" w:hAnsi="Calibri" w:eastAsia="Calibri"/>
                 <w:color w:val="1A1A1A"/>
                 <w:sz w:val="18"/>
                 <w:highlight w:val="yellow"/>
               </w:rPr>
-              <w:t>[Estado final]</w:t>
+              <w:t xml:space="preserve">Estado al 28-10: planificado para el sprint 4, del 6 al 12 de noviembre. </w:t>
+            </w:r>
+            <w:r>
+              <w:rPr>
+                <w:rFonts w:ascii="Calibri" w:hAnsi="Calibri" w:eastAsia="Calibri"/>
+                <w:b/>
+                <w:color w:val="1A1A1A"/>
+                <w:sz w:val="18"/>
+                <w:highlight w:val="yellow"/>
+              </w:rPr>
+              <w:t xml:space="preserve">[Estado final]</w:t>
             </w:r>
           </w:p>
           <w:p>
@@ -1494,12 +1530,21 @@
             <w:r>
               <w:rPr>
                 <w:rFonts w:ascii="Calibri" w:hAnsi="Calibri" w:eastAsia="Calibri"/>
-                <w:b/>
                 <w:color w:val="1A1A1A"/>
                 <w:sz w:val="18"/>
                 <w:highlight w:val="yellow"/>
               </w:rPr>
-              <w:t>[Estado final]</w:t>
+              <w:t xml:space="preserve">Estado al 28-10: planificado para el sprint 5, del 13 al 19 de noviembre. </w:t>
+            </w:r>
+            <w:r>
+              <w:rPr>
+                <w:rFonts w:ascii="Calibri" w:hAnsi="Calibri" w:eastAsia="Calibri"/>
+                <w:b/>
+                <w:color w:val="1A1A1A"/>
+                <w:sz w:val="18"/>
+                <w:highlight w:val="yellow"/>
+              </w:rPr>
+              <w:t xml:space="preserve">[Estado final]</w:t>
             </w:r>
           </w:p>
         </w:tc>
@@ -1609,6 +1654,22 @@
           <w:p>
             <w:pPr>
               <w:pStyle w:val="Prrafodelista"/>
+              <w:spacing w:after="80" w:before="0"/>
+              <w:ind w:left="0" w:firstLine="0"/>
+              <w:jc w:val="left"/>
+            </w:pPr>
+            <w:r>
+              <w:rPr>
+                <w:rFonts w:ascii="Calibri" w:hAnsi="Calibri" w:eastAsia="Calibri"/>
+                <w:color w:val="1A1A1A"/>
+                <w:sz w:val="18"/>
+              </w:rPr>
+              <w:t xml:space="preserve">El equipo trabaja con seis agentes de Claude Code, cada uno con un rol y un perímetro fijos: un orquestador que planifica y delega, un desarrollador de backend, uno de frontend, un QA que verifica sin corregir, un analista normativo y un diseñador UI/UX. Ningún agente fusiona su propio trabajo. Cada cambio termina en un pull request que revisa y fusiona una persona, y lo que toca datos sensibles o dinero lo revisa siempre la otra persona del equipo. GitHub Actions corre el pipeline de integración continua, y Trello lleva el avance y las horas reales de cada historia.</w:t>
+            </w:r>
+          </w:p>
+          <w:p>
+            <w:pPr>
+              <w:pStyle w:val="Prrafodelista"/>
               <w:spacing w:after="80" w:before="80"/>
               <w:ind w:left="0" w:firstLine="0"/>
               <w:jc w:val="left"/>
@@ -1636,7 +1697,7 @@
                 <w:color w:val="1A1A1A"/>
                 <w:sz w:val="18"/>
               </w:rPr>
-              <w:t xml:space="preserve">Los sprints de una semana con entregable verificable hacen visible un atraso en días y no en meses, en una ventana corta y con un equipo de dos personas sin dedicación completa. El reparto por ejes evita que una persona espere a la otra. La validación con criterios de falsación fijados de antemano permitió cambiar el producto con evidencia (ADR-023) antes de construirlo. Y el desarrollo asistido por IA, con la definición de terminado como control, permitió recuperar las tres semanas perdidas al inicio sin sacrificar la calidad. </w:t>
+              <w:t xml:space="preserve">Los sprints de una semana con entregable verificable hacen visible un atraso en días y no en meses, en una ventana corta y con un equipo de dos personas sin dedicación completa. El reparto por ejes evita que una persona espere a la otra. La validación con criterios de falsación fijados de antemano permitió cambiar el producto con evidencia (ADR-023) antes de construirlo. Y el desarrollo asistido por IA, con la definición de terminado como control, permitió recuperar las tres semanas perdidas al inicio sin sacrificar la calidad. Separar en agentes distintos a quien construye y a quien verifica mantiene ese control cuando el código lo genera un asistente. </w:t>
             </w:r>
             <w:r>
               <w:rPr>
@@ -1646,7 +1707,7 @@
                 <w:sz w:val="18"/>
                 <w:highlight w:val="yellow"/>
               </w:rPr>
-              <w:t>[Completar con la velocidad real medida en los sprints]</w:t>
+              <w:t xml:space="preserve">[Completar con la velocidad real y el factor de vibecoding medidos en los sprints]</w:t>
             </w:r>
           </w:p>
         </w:tc>
@@ -1797,15 +1858,15 @@
                 <w:color w:val="1A1A1A"/>
                 <w:sz w:val="18"/>
               </w:rPr>
-              <w:t>Sprint 1 (16 a 22 de octubre).</w:t>
-            </w:r>
-            <w:r>
-              <w:rPr>
-                <w:rFonts w:ascii="Calibri" w:hAnsi="Calibri" w:eastAsia="Calibri"/>
-                <w:color w:val="1A1A1A"/>
-                <w:sz w:val="18"/>
-              </w:rPr>
-              <w:t xml:space="preserve"> Identidad, grupo familiar y alta de la persona cuidada con consentimiento. </w:t>
+              <w:t xml:space="preserve">Sprint 1 (16 a 22 de octubre).</w:t>
+            </w:r>
+            <w:r>
+              <w:rPr>
+                <w:rFonts w:ascii="Calibri" w:hAnsi="Calibri" w:eastAsia="Calibri"/>
+                <w:color w:val="1A1A1A"/>
+                <w:sz w:val="18"/>
+              </w:rPr>
+              <w:t xml:space="preserve"> Identidad, grupo familiar y alta de la persona cuidada con consentimiento. Cerrado. </w:t>
             </w:r>
             <w:r>
               <w:rPr>
@@ -1815,6 +1876,135 @@
                 <w:sz w:val="18"/>
                 <w:highlight w:val="yellow"/>
               </w:rPr>
+              <w:t xml:space="preserve">[Completar con el factor de vibecoding medido en el sprint 1]</w:t>
+            </w:r>
+          </w:p>
+          <w:p>
+            <w:pPr>
+              <w:pStyle w:val="Prrafodelista"/>
+              <w:spacing w:after="80" w:before="0"/>
+              <w:ind w:left="200" w:hanging="160"/>
+              <w:jc w:val="left"/>
+            </w:pPr>
+            <w:r>
+              <w:rPr>
+                <w:rFonts w:ascii="Calibri" w:hAnsi="Calibri" w:eastAsia="Calibri"/>
+                <w:color w:val="1A1A1A"/>
+                <w:sz w:val="18"/>
+              </w:rPr>
+              <w:t xml:space="preserve">– </w:t>
+            </w:r>
+            <w:r>
+              <w:rPr>
+                <w:rFonts w:ascii="Calibri" w:hAnsi="Calibri" w:eastAsia="Calibri"/>
+                <w:b/>
+                <w:color w:val="1A1A1A"/>
+                <w:sz w:val="18"/>
+              </w:rPr>
+              <w:t xml:space="preserve">Sprint 2 (23 a 29 de octubre).</w:t>
+            </w:r>
+            <w:r>
+              <w:rPr>
+                <w:rFonts w:ascii="Calibri" w:hAnsi="Calibri" w:eastAsia="Calibri"/>
+                <w:color w:val="1A1A1A"/>
+                <w:sz w:val="18"/>
+              </w:rPr>
+              <w:t xml:space="preserve"> Ficha de relevo y acceso de relevo. En curso, con cierre el 29 de octubre. Ya están acordados el contrato de API de la ficha y del relevo (MATU-09) y el diseño de sus pantallas, y se aprobó el ADR-027. </w:t>
+            </w:r>
+            <w:r>
+              <w:rPr>
+                <w:rFonts w:ascii="Calibri" w:hAnsi="Calibri" w:eastAsia="Calibri"/>
+                <w:b/>
+                <w:color w:val="1A1A1A"/>
+                <w:sz w:val="18"/>
+                <w:highlight w:val="yellow"/>
+              </w:rPr>
+              <w:t xml:space="preserve">[Resultado]</w:t>
+            </w:r>
+          </w:p>
+          <w:p>
+            <w:pPr>
+              <w:pStyle w:val="Prrafodelista"/>
+              <w:spacing w:after="80" w:before="0"/>
+              <w:ind w:left="200" w:hanging="160"/>
+              <w:jc w:val="left"/>
+            </w:pPr>
+            <w:r>
+              <w:rPr>
+                <w:rFonts w:ascii="Calibri" w:hAnsi="Calibri" w:eastAsia="Calibri"/>
+                <w:color w:val="1A1A1A"/>
+                <w:sz w:val="18"/>
+              </w:rPr>
+              <w:t xml:space="preserve">– </w:t>
+            </w:r>
+            <w:r>
+              <w:rPr>
+                <w:rFonts w:ascii="Calibri" w:hAnsi="Calibri" w:eastAsia="Calibri"/>
+                <w:b/>
+                <w:color w:val="1A1A1A"/>
+                <w:sz w:val="18"/>
+              </w:rPr>
+              <w:t xml:space="preserve">Demostración navegable (viernes 30 de octubre).</w:t>
+            </w:r>
+            <w:r>
+              <w:rPr>
+                <w:rFonts w:ascii="Calibri" w:hAnsi="Calibri" w:eastAsia="Calibri"/>
+                <w:color w:val="1A1A1A"/>
+                <w:sz w:val="18"/>
+              </w:rPr>
+              <w:t xml:space="preserve"> MATU como aplicación web mobile first, con datos sintéticos y precios de ejemplo. Recorre la ficha y el acceso de relevo, la lista de reposición y el pedido con cobro único. Lo que todavía no está construido se muestra simulado. </w:t>
+            </w:r>
+            <w:r>
+              <w:rPr>
+                <w:rFonts w:ascii="Calibri" w:hAnsi="Calibri" w:eastAsia="Calibri"/>
+                <w:b/>
+                <w:color w:val="1A1A1A"/>
+                <w:sz w:val="18"/>
+                <w:highlight w:val="yellow"/>
+              </w:rPr>
+              <w:t xml:space="preserve">[Resultado de la demostración]</w:t>
+            </w:r>
+          </w:p>
+          <w:p>
+            <w:pPr>
+              <w:pStyle w:val="Prrafodelista"/>
+              <w:spacing w:after="80" w:before="0"/>
+              <w:ind w:left="200" w:hanging="160"/>
+              <w:jc w:val="left"/>
+            </w:pPr>
+            <w:r>
+              <w:rPr>
+                <w:rFonts w:ascii="Calibri" w:hAnsi="Calibri" w:eastAsia="Calibri"/>
+                <w:color w:val="1A1A1A"/>
+                <w:sz w:val="18"/>
+              </w:rPr>
+              <w:t xml:space="preserve">– </w:t>
+            </w:r>
+            <w:r>
+              <w:rPr>
+                <w:rFonts w:ascii="Calibri" w:hAnsi="Calibri" w:eastAsia="Calibri"/>
+                <w:b/>
+                <w:color w:val="1A1A1A"/>
+                <w:sz w:val="18"/>
+              </w:rPr>
+              <w:t>Sprint 3 (30 de octubre a 5 de noviembre).</w:t>
+            </w:r>
+            <w:r>
+              <w:rPr>
+                <w:rFonts w:ascii="Calibri" w:hAnsi="Calibri" w:eastAsia="Calibri"/>
+                <w:color w:val="1A1A1A"/>
+                <w:sz w:val="18"/>
+              </w:rPr>
+              <w:t xml:space="preserve"> App de familia y perfil de consumo con predicción. </w:t>
+            </w:r>
+            <w:r>
+              <w:rPr>
+                <w:rFonts w:ascii="Calibri" w:hAnsi="Calibri" w:eastAsia="Calibri"/>
+                <w:b/>
+                <w:color w:val="1A1A1A"/>
+                <w:sz w:val="18"/>
+                <w:highlight w:val="yellow"/>
+              </w:rPr>
               <w:t>[Resultado]</w:t>
             </w:r>
           </w:p>
@@ -1840,15 +2030,15 @@
                 <w:color w:val="1A1A1A"/>
                 <w:sz w:val="18"/>
               </w:rPr>
-              <w:t>Sprint 2 (23 a 29 de octubre).</w:t>
-            </w:r>
-            <w:r>
-              <w:rPr>
-                <w:rFonts w:ascii="Calibri" w:hAnsi="Calibri" w:eastAsia="Calibri"/>
-                <w:color w:val="1A1A1A"/>
-                <w:sz w:val="18"/>
-              </w:rPr>
-              <w:t xml:space="preserve"> Ficha de relevo y acceso de relevo. </w:t>
+              <w:t xml:space="preserve">Sprint 4 (6 a 12 de noviembre).</w:t>
+            </w:r>
+            <w:r>
+              <w:rPr>
+                <w:rFonts w:ascii="Calibri" w:hAnsi="Calibri" w:eastAsia="Calibri"/>
+                <w:color w:val="1A1A1A"/>
+                <w:sz w:val="18"/>
+              </w:rPr>
+              <w:t xml:space="preserve"> Catálogo con precios exactos, lista de reposición, pedido y pago con cobro único del total confirmado (ADR-027). </w:t>
             </w:r>
             <w:r>
               <w:rPr>
@@ -1858,93 +2048,7 @@
                 <w:sz w:val="18"/>
                 <w:highlight w:val="yellow"/>
               </w:rPr>
-              <w:t>[Resultado]</w:t>
-            </w:r>
-          </w:p>
-          <w:p>
-            <w:pPr>
-              <w:pStyle w:val="Prrafodelista"/>
-              <w:spacing w:after="80" w:before="0"/>
-              <w:ind w:left="200" w:hanging="160"/>
-              <w:jc w:val="left"/>
-            </w:pPr>
-            <w:r>
-              <w:rPr>
-                <w:rFonts w:ascii="Calibri" w:hAnsi="Calibri" w:eastAsia="Calibri"/>
-                <w:color w:val="1A1A1A"/>
-                <w:sz w:val="18"/>
-              </w:rPr>
-              <w:t xml:space="preserve">– </w:t>
-            </w:r>
-            <w:r>
-              <w:rPr>
-                <w:rFonts w:ascii="Calibri" w:hAnsi="Calibri" w:eastAsia="Calibri"/>
-                <w:b/>
-                <w:color w:val="1A1A1A"/>
-                <w:sz w:val="18"/>
-              </w:rPr>
-              <w:t>Sprint 3 (30 de octubre a 5 de noviembre).</w:t>
-            </w:r>
-            <w:r>
-              <w:rPr>
-                <w:rFonts w:ascii="Calibri" w:hAnsi="Calibri" w:eastAsia="Calibri"/>
-                <w:color w:val="1A1A1A"/>
-                <w:sz w:val="18"/>
-              </w:rPr>
-              <w:t xml:space="preserve"> App de familia y perfil de consumo con predicción. </w:t>
-            </w:r>
-            <w:r>
-              <w:rPr>
-                <w:rFonts w:ascii="Calibri" w:hAnsi="Calibri" w:eastAsia="Calibri"/>
-                <w:b/>
-                <w:color w:val="1A1A1A"/>
-                <w:sz w:val="18"/>
-                <w:highlight w:val="yellow"/>
-              </w:rPr>
-              <w:t>[Resultado]</w:t>
-            </w:r>
-          </w:p>
-          <w:p>
-            <w:pPr>
-              <w:pStyle w:val="Prrafodelista"/>
-              <w:spacing w:after="80" w:before="0"/>
-              <w:ind w:left="200" w:hanging="160"/>
-              <w:jc w:val="left"/>
-            </w:pPr>
-            <w:r>
-              <w:rPr>
-                <w:rFonts w:ascii="Calibri" w:hAnsi="Calibri" w:eastAsia="Calibri"/>
-                <w:color w:val="1A1A1A"/>
-                <w:sz w:val="18"/>
-              </w:rPr>
-              <w:t xml:space="preserve">– </w:t>
-            </w:r>
-            <w:r>
-              <w:rPr>
-                <w:rFonts w:ascii="Calibri" w:hAnsi="Calibri" w:eastAsia="Calibri"/>
-                <w:b/>
-                <w:color w:val="1A1A1A"/>
-                <w:sz w:val="18"/>
-              </w:rPr>
-              <w:t>Sprint 4 (6 a 12 de noviembre).</w:t>
-            </w:r>
-            <w:r>
-              <w:rPr>
-                <w:rFonts w:ascii="Calibri" w:hAnsi="Calibri" w:eastAsia="Calibri"/>
-                <w:color w:val="1A1A1A"/>
-                <w:sz w:val="18"/>
-              </w:rPr>
-              <w:t xml:space="preserve"> Catálogo, lista de reposición, pedido y pago. </w:t>
-            </w:r>
-            <w:r>
-              <w:rPr>
-                <w:rFonts w:ascii="Calibri" w:hAnsi="Calibri" w:eastAsia="Calibri"/>
-                <w:b/>
-                <w:color w:val="1A1A1A"/>
-                <w:sz w:val="18"/>
-                <w:highlight w:val="yellow"/>
-              </w:rPr>
-              <w:t>[Resultado]</w:t>
+              <w:t xml:space="preserve">[Resultado]</w:t>
             </w:r>
           </w:p>
           <w:p>
@@ -2020,7 +2124,7 @@
                 <w:color w:val="1A1A1A"/>
                 <w:sz w:val="18"/>
               </w:rPr>
-              <w:t xml:space="preserve">El diseño cerrado antes de construir, el modelo de datos probado en SQL antes de tener API, el backlog con criterios de aceptación y el desarrollo asistido por IA. </w:t>
+              <w:t xml:space="preserve">El diseño cerrado antes de construir, el modelo de datos probado en SQL antes de tener API, el backlog con criterios de aceptación y el desarrollo asistido por IA. En los sprints se sumaron el trabajo con seis agentes de roles separados, la revisión cruzada de cada pull request y la investigación normativa hecha antes de construir el pago. </w:t>
             </w:r>
             <w:r>
               <w:rPr>
@@ -2030,7 +2134,7 @@
                 <w:sz w:val="18"/>
                 <w:highlight w:val="yellow"/>
               </w:rPr>
-              <w:t>[Agregar los que aparezcan en los sprints]</w:t>
+              <w:t xml:space="preserve">[Agregar los que aparezcan en los sprints 3 a 5]</w:t>
             </w:r>
           </w:p>
           <w:p>
@@ -2063,7 +2167,7 @@
                 <w:color w:val="1A1A1A"/>
                 <w:sz w:val="18"/>
               </w:rPr>
-              <w:t xml:space="preserve">El desarrollo empezó tres semanas tarde, mientras se acordaba el entorno con el docente. Jorge redujo su disponibilidad por la práctica profesional desde el 1 de octubre. La prueba de concepto de Transbank quedó incompleta en el sprint 0 y mostró que el débito no admite captura diferida. </w:t>
+              <w:t xml:space="preserve">El desarrollo empezó tres semanas tarde, mientras se acordaba el entorno con el docente. Jorge redujo su disponibilidad por la práctica profesional desde el 1 de octubre. La prueba de concepto de Transbank quedó incompleta en el sprint 0 y mostró que el débito no admite captura diferida. Como el débito es el medio mayoritario del segmento, hubo que rediseñar el cobro (ADR-027). </w:t>
             </w:r>
             <w:r>
               <w:rPr>
@@ -2073,7 +2177,7 @@
                 <w:sz w:val="18"/>
                 <w:highlight w:val="yellow"/>
               </w:rPr>
-              <w:t>[Agregar las de los sprints]</w:t>
+              <w:t xml:space="preserve">[Agregar las de los sprints]</w:t>
             </w:r>
           </w:p>
           <w:p>
@@ -2106,8 +2210,148 @@
                 <w:color w:val="1A1A1A"/>
                 <w:sz w:val="18"/>
               </w:rPr>
-              <w:t xml:space="preserve">Calendario reagrupado de ocho a cinco sprints de desarrollo con dos de reserva, modelo de datos adelantado al sprint 0, staging adelantado al sprint 3, usabilidad en dos rondas, plan B del ADR-006 para débito, y dos repositorios separados para evidencias y código. </w:t>
-            </w:r>
+              <w:t xml:space="preserve">Calendario reagrupado de ocho a cinco sprints de desarrollo con dos de reserva, modelo de datos adelantado al sprint 0, staging adelantado al sprint 3, usabilidad en dos rondas, y dos repositorios separados para evidencias y código. Desde el 13 de octubre se sumaron cuatro ajustes:</w:t>
+            </w:r>
+          </w:p>
+          <w:p>
+            <w:pPr>
+              <w:pStyle w:val="Prrafodelista"/>
+              <w:spacing w:after="80" w:before="0"/>
+              <w:ind w:left="200" w:hanging="160"/>
+              <w:jc w:val="left"/>
+            </w:pPr>
+            <w:r>
+              <w:rPr>
+                <w:rFonts w:ascii="Calibri" w:hAnsi="Calibri" w:eastAsia="Calibri"/>
+                <w:color w:val="1A1A1A"/>
+                <w:sz w:val="18"/>
+              </w:rPr>
+              <w:t xml:space="preserve">– </w:t>
+            </w:r>
+            <w:r>
+              <w:rPr>
+                <w:rFonts w:ascii="Calibri" w:hAnsi="Calibri" w:eastAsia="Calibri"/>
+                <w:b/>
+                <w:color w:val="1A1A1A"/>
+                <w:sz w:val="18"/>
+              </w:rPr>
+              <w:t xml:space="preserve">Aplicación web mobile first (ADR-026, 14 de octubre).</w:t>
+            </w:r>
+            <w:r>
+              <w:rPr>
+                <w:rFonts w:ascii="Calibri" w:hAnsi="Calibri" w:eastAsia="Calibri"/>
+                <w:color w:val="1A1A1A"/>
+                <w:sz w:val="18"/>
+              </w:rPr>
+              <w:t xml:space="preserve"> Por sugerencia del profesor, en el semestre MATU se construye como aplicación web mobile first, con React 19, TypeScript, Vite y Tailwind CSS v4. Se diseña primero para un teléfono de 360 px de ancho. Reemplaza al Flutter del ADR-005. MATU sigue siendo una app móvil en su visión: la web es el paso práctico del semestre, y la app móvil nativa se decide en una etapa posterior.</w:t>
+            </w:r>
+          </w:p>
+          <w:p>
+            <w:pPr>
+              <w:pStyle w:val="Prrafodelista"/>
+              <w:spacing w:after="80" w:before="0"/>
+              <w:ind w:left="200" w:hanging="160"/>
+              <w:jc w:val="left"/>
+            </w:pPr>
+            <w:r>
+              <w:rPr>
+                <w:rFonts w:ascii="Calibri" w:hAnsi="Calibri" w:eastAsia="Calibri"/>
+                <w:color w:val="1A1A1A"/>
+                <w:sz w:val="18"/>
+              </w:rPr>
+              <w:t xml:space="preserve">– </w:t>
+            </w:r>
+            <w:r>
+              <w:rPr>
+                <w:rFonts w:ascii="Calibri" w:hAnsi="Calibri" w:eastAsia="Calibri"/>
+                <w:b/>
+                <w:color w:val="1A1A1A"/>
+                <w:sz w:val="18"/>
+              </w:rPr>
+              <w:t xml:space="preserve">Precios exactos y un solo cobro (ADR-027, aprobado el 26 de octubre).</w:t>
+            </w:r>
+            <w:r>
+              <w:rPr>
+                <w:rFonts w:ascii="Calibri" w:hAnsi="Calibri" w:eastAsia="Calibri"/>
+                <w:color w:val="1A1A1A"/>
+                <w:sz w:val="18"/>
+              </w:rPr>
+              <w:t xml:space="preserve"> El catálogo muestra precios exactos de comercios en convenio, simulados mientras no haya convenio. Antes de cobrar se confirma el stock. Se cobra una sola vez el total, con un envío único por pedido, en una venta normal de Webpay Plus. Crédito y débito funcionan igual, y el total confirmado vale 15 minutos. MATU vende y emite una boleta. Si un producto no llega, se devuelve su precio el mismo día a la misma tarjeta, y nunca se reemplaza por otra marca. RF-21 se redefinió: si falta un producto, se busca en otro comercio o se quita del pedido. Reemplaza a la autorización diferida con captura por el monto real y al plan B del débito (ADR-006). La captura diferida no admite débito, y con el cobro único la familia ve el monto exacto antes de pagar.</w:t>
+            </w:r>
+          </w:p>
+          <w:p>
+            <w:pPr>
+              <w:pStyle w:val="Prrafodelista"/>
+              <w:spacing w:after="80" w:before="0"/>
+              <w:ind w:left="200" w:hanging="160"/>
+              <w:jc w:val="left"/>
+            </w:pPr>
+            <w:r>
+              <w:rPr>
+                <w:rFonts w:ascii="Calibri" w:hAnsi="Calibri" w:eastAsia="Calibri"/>
+                <w:color w:val="1A1A1A"/>
+                <w:sz w:val="18"/>
+              </w:rPr>
+              <w:t xml:space="preserve">– </w:t>
+            </w:r>
+            <w:r>
+              <w:rPr>
+                <w:rFonts w:ascii="Calibri" w:hAnsi="Calibri" w:eastAsia="Calibri"/>
+                <w:b/>
+                <w:color w:val="1A1A1A"/>
+                <w:sz w:val="18"/>
+              </w:rPr>
+              <w:t xml:space="preserve">Investigación normativa (27 de octubre).</w:t>
+            </w:r>
+            <w:r>
+              <w:rPr>
+                <w:rFonts w:ascii="Calibri" w:hAnsi="Calibri" w:eastAsia="Calibri"/>
+                <w:color w:val="1A1A1A"/>
+                <w:sz w:val="18"/>
+              </w:rPr>
+              <w:t xml:space="preserve"> Antes de construir el pago se revisó el texto de la Ley 19.496, con sus reglamentos de retracto y de comercio electrónico, y el de la Ley 19.628 en la versión que fija la Ley 21.719. De ocho preguntas, cinco se resolvieron por diseño con la opción más protectora. Las otras tres quedaron para una consulta legal o contable, y ninguna bloquea el semestre, porque no hay datos ni dinero reales. Durante el semestre el piloto opera solo en el ambiente de integración de Transbank, con datos sintéticos y sin cobros reales (MATU-27).</w:t>
+            </w:r>
+          </w:p>
+          <w:p>
+            <w:pPr>
+              <w:pStyle w:val="Prrafodelista"/>
+              <w:spacing w:after="80" w:before="0"/>
+              <w:ind w:left="200" w:hanging="160"/>
+              <w:jc w:val="left"/>
+            </w:pPr>
+            <w:r>
+              <w:rPr>
+                <w:rFonts w:ascii="Calibri" w:hAnsi="Calibri" w:eastAsia="Calibri"/>
+                <w:color w:val="1A1A1A"/>
+                <w:sz w:val="18"/>
+              </w:rPr>
+              <w:t xml:space="preserve">– </w:t>
+            </w:r>
+            <w:r>
+              <w:rPr>
+                <w:rFonts w:ascii="Calibri" w:hAnsi="Calibri" w:eastAsia="Calibri"/>
+                <w:b/>
+                <w:color w:val="1A1A1A"/>
+                <w:sz w:val="18"/>
+              </w:rPr>
+              <w:t xml:space="preserve">Privacidad del relevo (MATU-09, 27 de octubre).</w:t>
+            </w:r>
+            <w:r>
+              <w:rPr>
+                <w:rFonts w:ascii="Calibri" w:hAnsi="Calibri" w:eastAsia="Calibri"/>
+                <w:color w:val="1A1A1A"/>
+                <w:sz w:val="18"/>
+              </w:rPr>
+              <w:t xml:space="preserve"> El enlace lleva el token en el fragmento de la dirección y se abre con un PIN de cuatro dígitos. La API no envía el PIN: lo ve una sola vez quien comparte, que se lo dicta al relevo. La IP no se guarda en la base ni en los registros. El motivo del acceso se elige de una lista cerrada, sin texto libre. El teléfono del relevo se borra 30 días después de que el acceso vence o se revoca.</w:t>
+            </w:r>
+          </w:p>
+          <w:p>
+            <w:pPr>
+              <w:pStyle w:val="Prrafodelista"/>
+              <w:spacing w:after="80" w:before="0"/>
+              <w:ind w:left="0" w:firstLine="0"/>
+              <w:jc w:val="left"/>
+            </w:pPr>
             <w:r>
               <w:rPr>
                 <w:rFonts w:ascii="Calibri" w:hAnsi="Calibri" w:eastAsia="Calibri"/>
@@ -2116,7 +2360,7 @@
                 <w:sz w:val="18"/>
                 <w:highlight w:val="yellow"/>
               </w:rPr>
-              <w:t>[Agregar los ajustes de los sprints]</w:t>
+              <w:t xml:space="preserve">[Agregar los ajustes de los sprints 3 a 5]</w:t>
             </w:r>
           </w:p>
         </w:tc>
@@ -2262,6 +2506,80 @@
           <w:p>
             <w:pPr>
               <w:pStyle w:val="Prrafodelista"/>
+              <w:spacing w:after="80" w:before="0"/>
+              <w:ind w:left="200" w:hanging="160"/>
+              <w:jc w:val="left"/>
+            </w:pPr>
+            <w:r>
+              <w:rPr>
+                <w:rFonts w:ascii="Calibri" w:hAnsi="Calibri" w:eastAsia="Calibri"/>
+                <w:color w:val="1A1A1A"/>
+                <w:sz w:val="18"/>
+              </w:rPr>
+              <w:t xml:space="preserve">– ADR-027 incorporado a la arquitectura, y migración 0002 del modelo de datos que lo implementa (MATU, docs/, y MATU_PROYECTO, backend/alembic).</w:t>
+            </w:r>
+          </w:p>
+          <w:p>
+            <w:pPr>
+              <w:pStyle w:val="Prrafodelista"/>
+              <w:spacing w:after="80" w:before="0"/>
+              <w:ind w:left="200" w:hanging="160"/>
+              <w:jc w:val="left"/>
+            </w:pPr>
+            <w:r>
+              <w:rPr>
+                <w:rFonts w:ascii="Calibri" w:hAnsi="Calibri" w:eastAsia="Calibri"/>
+                <w:color w:val="1A1A1A"/>
+                <w:sz w:val="18"/>
+              </w:rPr>
+              <w:t xml:space="preserve">– Contrato de API de la ficha y del relevo (MATU-09).</w:t>
+            </w:r>
+          </w:p>
+          <w:p>
+            <w:pPr>
+              <w:pStyle w:val="Prrafodelista"/>
+              <w:spacing w:after="80" w:before="0"/>
+              <w:ind w:left="200" w:hanging="160"/>
+              <w:jc w:val="left"/>
+            </w:pPr>
+            <w:r>
+              <w:rPr>
+                <w:rFonts w:ascii="Calibri" w:hAnsi="Calibri" w:eastAsia="Calibri"/>
+                <w:color w:val="1A1A1A"/>
+                <w:sz w:val="18"/>
+              </w:rPr>
+              <w:t xml:space="preserve">– Política de privacidad v0.9, registro de tratamientos, figura legal del piloto e investigación normativa del ADR-027 (repositorio MATU, docs/legal/).</w:t>
+            </w:r>
+          </w:p>
+          <w:p>
+            <w:pPr>
+              <w:pStyle w:val="Prrafodelista"/>
+              <w:spacing w:after="80" w:before="0"/>
+              <w:ind w:left="200" w:hanging="160"/>
+              <w:jc w:val="left"/>
+            </w:pPr>
+            <w:r>
+              <w:rPr>
+                <w:rFonts w:ascii="Calibri" w:hAnsi="Calibri" w:eastAsia="Calibri"/>
+                <w:color w:val="1A1A1A"/>
+                <w:sz w:val="18"/>
+              </w:rPr>
+              <w:t xml:space="preserve">– Especificación de diseño y demostración navegable del 30 de octubre (MATU_PROYECTO, Demo/). </w:t>
+            </w:r>
+            <w:r>
+              <w:rPr>
+                <w:rFonts w:ascii="Calibri" w:hAnsi="Calibri" w:eastAsia="Calibri"/>
+                <w:b/>
+                <w:color w:val="1A1A1A"/>
+                <w:sz w:val="18"/>
+                <w:highlight w:val="yellow"/>
+              </w:rPr>
+              <w:t xml:space="preserve">[Enlace y capturas después de la demostración]</w:t>
+            </w:r>
+          </w:p>
+          <w:p>
+            <w:pPr>
+              <w:pStyle w:val="Prrafodelista"/>
               <w:spacing w:after="80" w:before="80"/>
               <w:ind w:left="0" w:firstLine="0"/>
               <w:jc w:val="left"/>
@@ -2289,7 +2607,7 @@
                 <w:color w:val="1A1A1A"/>
                 <w:sz w:val="18"/>
               </w:rPr>
-              <w:t xml:space="preserve">– Aplicación integrada en operación: app de familia, vista web de comercio y backoffice en el entorno de demostración. </w:t>
+              <w:t xml:space="preserve">– Aplicación web mobile first en operación: app de familia, vista de relevo, vista de comercio y backoffice en el entorno de demostración. </w:t>
             </w:r>
             <w:r>
               <w:rPr>
@@ -2299,7 +2617,7 @@
                 <w:sz w:val="18"/>
                 <w:highlight w:val="yellow"/>
               </w:rPr>
-              <w:t>[Enlace y capturas]</w:t>
+              <w:t xml:space="preserve">[Enlace y capturas]</w:t>
             </w:r>
           </w:p>
           <w:p>

</xml_diff>

<commit_message>
docs(fase-2): informe final 2.6 cerrado con el estado al 31 de octubre
El profesor pidió entregar la 2.6 con lo que hay hasta ahora; el sprint 5
entrega la evidencia de la Fase 3. Se quita el aviso de borrador, los
marcadores y el resaltado amarillo, y se completan en español e inglés:
objetivo 3 cumplido, cierre de los sprints 1 y 2, demostración del 30 de
octubre, sprint 3 en curso, factor de vibecoding medido hasta ahora,
dificultades, tres ajustes nuevos y las evidencias al cierre de la fase.

Co-Authored-By: Claude Opus 5.5 <noreply@anthropic.com>
</commit_message>
<xml_diff>
--- a/Fase 2/Evidencias Grupales/2.6_GuiaEstudiante_Fase 2_Informe Final Proyecto APT(Español).docx
+++ b/Fase 2/Evidencias Grupales/2.6_GuiaEstudiante_Fase 2_Informe Final Proyecto APT(Español).docx
@@ -401,20 +401,6 @@
         </w:rPr>
       </w:pPr>
     </w:p>
-    <w:p>
-      <w:pPr>
-        <w:spacing w:after="160"/>
-      </w:pPr>
-      <w:r>
-        <w:rPr>
-          <w:rFonts w:ascii="Calibri" w:hAnsi="Calibri"/>
-          <w:b/>
-          <w:sz w:val="20"/>
-          <w:highlight w:val="yellow"/>
-        </w:rPr>
-        <w:t>BORRADOR actualizado al 28 de octubre de 2026. Este informe se completa al cierre del sprint 5 (19 de noviembre) para la entrega final de la semana 15. Lo marcado en amarillo depende del desarrollo que viene.</w:t>
-      </w:r>
-    </w:p>
     <w:tbl>
       <w:tblPr>
         <w:tblStyle w:val="Tablaconcuadrcula"/>
@@ -1209,25 +1195,7 @@
                 <w:color w:val="1A1A1A"/>
                 <w:sz w:val="18"/>
               </w:rPr>
-              <w:t xml:space="preserve">Que una cuidadora pueda delegar el cuidado por unas horas con una ficha de relevo de tres campos que comparte por un enlace acotado y revocable, y que el sistema avise antes de que se acabe un insumo. </w:t>
-            </w:r>
-            <w:r>
-              <w:rPr>
-                <w:rFonts w:ascii="Calibri" w:hAnsi="Calibri" w:eastAsia="Calibri"/>
-                <w:b/>
-                <w:color w:val="1A1A1A"/>
-                <w:sz w:val="18"/>
-                <w:highlight w:val="yellow"/>
-              </w:rPr>
-              <w:t>[Completar con el aporte demostrado: resultado de las pruebas de usabilidad y de la demostración final]</w:t>
-            </w:r>
-            <w:r>
-              <w:rPr>
-                <w:rFonts w:ascii="Calibri" w:hAnsi="Calibri" w:eastAsia="Calibri"/>
-                <w:color w:val="1A1A1A"/>
-                <w:sz w:val="18"/>
-              </w:rPr>
-              <w:t>.</w:t>
+              <w:t xml:space="preserve">Que una cuidadora pueda delegar el cuidado por unas horas con una ficha de relevo de tres campos que comparte por un enlace acotado y revocable, y que el sistema avise antes de que se acabe un insumo.. Al cierre de la Fase 2 ese aporte ya funciona: la ficha se guarda cifrada, se comparte con un enlace y un PIN, se abre desde el teléfono del relevo y la cuidadora puede cortar el acceso en el acto. La demostración del 30 de octubre mostró además las tres capas de punta a punta con datos sintéticos.</w:t>
             </w:r>
           </w:p>
         </w:tc>
@@ -1385,166 +1353,71 @@
                 <w:color w:val="1A1A1A"/>
                 <w:sz w:val="18"/>
               </w:rPr>
-              <w:t xml:space="preserve">3. Construir el plan de cuidado con acceso de relevo temporal y revocable, auditoría de todo acceso y borrado criptográfico conforme a la Ley 21.719, al 29 de octubre. </w:t>
-            </w:r>
-            <w:r>
-              <w:rPr>
-                <w:rFonts w:ascii="Calibri" w:hAnsi="Calibri" w:eastAsia="Calibri"/>
-                <w:color w:val="1A1A1A"/>
-                <w:sz w:val="18"/>
-                <w:highlight w:val="yellow"/>
-              </w:rPr>
-              <w:t xml:space="preserve">Estado al 28-10: contrato de API acordado (MATU-09) y diseño de pantallas listo. La implementación tiene su cierre previsto el 30 de octubre. </w:t>
-            </w:r>
-            <w:r>
-              <w:rPr>
-                <w:rFonts w:ascii="Calibri" w:hAnsi="Calibri" w:eastAsia="Calibri"/>
-                <w:b/>
-                <w:color w:val="1A1A1A"/>
-                <w:sz w:val="18"/>
-                <w:highlight w:val="yellow"/>
-              </w:rPr>
-              <w:t xml:space="preserve">[Estado final]</w:t>
-            </w:r>
-          </w:p>
-          <w:p>
-            <w:pPr>
-              <w:pStyle w:val="Prrafodelista"/>
-              <w:spacing w:after="80" w:before="0"/>
-              <w:ind w:left="0" w:firstLine="0"/>
-              <w:jc w:val="left"/>
-            </w:pPr>
-            <w:r>
-              <w:rPr>
-                <w:rFonts w:ascii="Calibri" w:hAnsi="Calibri" w:eastAsia="Calibri"/>
-                <w:color w:val="1A1A1A"/>
-                <w:sz w:val="18"/>
-              </w:rPr>
-              <w:t xml:space="preserve">4. Implementar el cálculo de fecha de quiebre y la alerta anticipada por insumo, con ocho pruebas de dominio en verde, al 5 de noviembre. </w:t>
-            </w:r>
-            <w:r>
-              <w:rPr>
-                <w:rFonts w:ascii="Calibri" w:hAnsi="Calibri" w:eastAsia="Calibri"/>
-                <w:color w:val="1A1A1A"/>
-                <w:sz w:val="18"/>
-                <w:highlight w:val="yellow"/>
-              </w:rPr>
-              <w:t xml:space="preserve">Estado al 28-10: planificado para el sprint 3, del 30 de octubre al 5 de noviembre. </w:t>
-            </w:r>
-            <w:r>
-              <w:rPr>
-                <w:rFonts w:ascii="Calibri" w:hAnsi="Calibri" w:eastAsia="Calibri"/>
-                <w:b/>
-                <w:color w:val="1A1A1A"/>
-                <w:sz w:val="18"/>
-                <w:highlight w:val="yellow"/>
-              </w:rPr>
-              <w:t xml:space="preserve">[Estado final]</w:t>
-            </w:r>
-          </w:p>
-          <w:p>
-            <w:pPr>
-              <w:pStyle w:val="Prrafodelista"/>
-              <w:spacing w:after="80" w:before="0"/>
-              <w:ind w:left="0" w:firstLine="0"/>
-              <w:jc w:val="left"/>
-            </w:pPr>
-            <w:r>
-              <w:rPr>
-                <w:rFonts w:ascii="Calibri" w:hAnsi="Calibri" w:eastAsia="Calibri"/>
-                <w:color w:val="1A1A1A"/>
-                <w:sz w:val="18"/>
-              </w:rPr>
-              <w:t xml:space="preserve">5. Entregar la lista de reposición exportable como documento y como enlace compartible, operativa sin convenio comercial, al 12 de noviembre. </w:t>
-            </w:r>
-            <w:r>
-              <w:rPr>
-                <w:rFonts w:ascii="Calibri" w:hAnsi="Calibri" w:eastAsia="Calibri"/>
-                <w:color w:val="1A1A1A"/>
-                <w:sz w:val="18"/>
-                <w:highlight w:val="yellow"/>
-              </w:rPr>
-              <w:t xml:space="preserve">Estado al 28-10: planificado para el sprint 4, del 6 al 12 de noviembre. </w:t>
-            </w:r>
-            <w:r>
-              <w:rPr>
-                <w:rFonts w:ascii="Calibri" w:hAnsi="Calibri" w:eastAsia="Calibri"/>
-                <w:b/>
-                <w:color w:val="1A1A1A"/>
-                <w:sz w:val="18"/>
-                <w:highlight w:val="yellow"/>
-              </w:rPr>
-              <w:t xml:space="preserve">[Estado final]</w:t>
-            </w:r>
-          </w:p>
-          <w:p>
-            <w:pPr>
-              <w:pStyle w:val="Prrafodelista"/>
-              <w:spacing w:after="80" w:before="0"/>
-              <w:ind w:left="0" w:firstLine="0"/>
-              <w:jc w:val="left"/>
-            </w:pPr>
-            <w:r>
-              <w:rPr>
-                <w:rFonts w:ascii="Calibri" w:hAnsi="Calibri" w:eastAsia="Calibri"/>
-                <w:color w:val="1A1A1A"/>
-                <w:sz w:val="18"/>
-              </w:rPr>
-              <w:t xml:space="preserve">6. Construir el flujo de pedido con cobro único del total confirmado (ADR-027), con los nueve casos obligatorios del flujo de pago en verde, al 12 de noviembre. Este objetivo cambió el 26 de octubre. Antes decía autorización diferida y captura por el monto real, pero la prueba de concepto de Transbank mostró que la captura diferida no admite débito. Con un solo cobro, además, la familia ve el monto exacto antes de pagar. </w:t>
-            </w:r>
-            <w:r>
-              <w:rPr>
-                <w:rFonts w:ascii="Calibri" w:hAnsi="Calibri" w:eastAsia="Calibri"/>
-                <w:color w:val="1A1A1A"/>
-                <w:sz w:val="18"/>
-                <w:highlight w:val="yellow"/>
-              </w:rPr>
-              <w:t xml:space="preserve">Estado al 28-10: planificado para el sprint 4, del 6 al 12 de noviembre. </w:t>
-            </w:r>
-            <w:r>
-              <w:rPr>
-                <w:rFonts w:ascii="Calibri" w:hAnsi="Calibri" w:eastAsia="Calibri"/>
-                <w:b/>
-                <w:color w:val="1A1A1A"/>
-                <w:sz w:val="18"/>
-                <w:highlight w:val="yellow"/>
-              </w:rPr>
-              <w:t xml:space="preserve">[Estado final]</w:t>
-            </w:r>
-          </w:p>
-          <w:p>
-            <w:pPr>
-              <w:pStyle w:val="Prrafodelista"/>
-              <w:spacing w:after="80" w:before="0"/>
-              <w:ind w:left="0" w:firstLine="0"/>
-              <w:jc w:val="left"/>
-            </w:pPr>
-            <w:r>
-              <w:rPr>
-                <w:rFonts w:ascii="Calibri" w:hAnsi="Calibri" w:eastAsia="Calibri"/>
-                <w:color w:val="1A1A1A"/>
-                <w:sz w:val="18"/>
-              </w:rPr>
-              <w:t xml:space="preserve">7. Desplegar el sistema en un entorno de demostración con los seis recorridos críticos operativos y el pipeline de integración continua en verde, al 19 de noviembre. </w:t>
-            </w:r>
-            <w:r>
-              <w:rPr>
-                <w:rFonts w:ascii="Calibri" w:hAnsi="Calibri" w:eastAsia="Calibri"/>
-                <w:color w:val="1A1A1A"/>
-                <w:sz w:val="18"/>
-                <w:highlight w:val="yellow"/>
-              </w:rPr>
-              <w:t xml:space="preserve">Estado al 28-10: planificado para el sprint 5, del 13 al 19 de noviembre. </w:t>
-            </w:r>
-            <w:r>
-              <w:rPr>
-                <w:rFonts w:ascii="Calibri" w:hAnsi="Calibri" w:eastAsia="Calibri"/>
-                <w:b/>
-                <w:color w:val="1A1A1A"/>
-                <w:sz w:val="18"/>
-                <w:highlight w:val="yellow"/>
-              </w:rPr>
-              <w:t xml:space="preserve">[Estado final]</w:t>
+              <w:t xml:space="preserve">3. Construir el plan de cuidado con acceso de relevo temporal y revocable, auditoría de todo acceso y borrado criptográfico conforme a la Ley 21.719, al 29 de octubre. Cumplido en el sprint 2. La ficha se cifra con una clave por persona (AES-256-GCM) y cada lectura y escritura queda auditada. Dos ediciones simultáneas no se pisan. El relevo abre la ficha con un enlace y un PIN, desde una página web en su teléfono, y el acceso vence solo o se revoca en el acto. Una clave destruida no se puede volver a crear, lo que deja posible el borrado criptográfico.</w:t>
+            </w:r>
+          </w:p>
+          <w:p>
+            <w:pPr>
+              <w:pStyle w:val="Prrafodelista"/>
+              <w:spacing w:after="80" w:before="0"/>
+              <w:ind w:left="0" w:firstLine="0"/>
+              <w:jc w:val="left"/>
+            </w:pPr>
+            <w:r>
+              <w:rPr>
+                <w:rFonts w:ascii="Calibri" w:hAnsi="Calibri" w:eastAsia="Calibri"/>
+                <w:color w:val="1A1A1A"/>
+                <w:sz w:val="18"/>
+              </w:rPr>
+              <w:t xml:space="preserve">4. Implementar el cálculo de fecha de quiebre y la alerta anticipada por insumo, con ocho pruebas de dominio en verde, al 5 de noviembre. En curso en el sprint 3, del 30 de octubre al 5 de noviembre (MATU-36 y MATU-37).</w:t>
+            </w:r>
+          </w:p>
+          <w:p>
+            <w:pPr>
+              <w:pStyle w:val="Prrafodelista"/>
+              <w:spacing w:after="80" w:before="0"/>
+              <w:ind w:left="0" w:firstLine="0"/>
+              <w:jc w:val="left"/>
+            </w:pPr>
+            <w:r>
+              <w:rPr>
+                <w:rFonts w:ascii="Calibri" w:hAnsi="Calibri" w:eastAsia="Calibri"/>
+                <w:color w:val="1A1A1A"/>
+                <w:sz w:val="18"/>
+              </w:rPr>
+              <w:t xml:space="preserve">5. Entregar la lista de reposición exportable como documento y como enlace compartible, operativa sin convenio comercial, al 12 de noviembre. Planificado para el sprint 4, del 6 al 12 de noviembre.</w:t>
+            </w:r>
+          </w:p>
+          <w:p>
+            <w:pPr>
+              <w:pStyle w:val="Prrafodelista"/>
+              <w:spacing w:after="80" w:before="0"/>
+              <w:ind w:left="0" w:firstLine="0"/>
+              <w:jc w:val="left"/>
+            </w:pPr>
+            <w:r>
+              <w:rPr>
+                <w:rFonts w:ascii="Calibri" w:hAnsi="Calibri" w:eastAsia="Calibri"/>
+                <w:color w:val="1A1A1A"/>
+                <w:sz w:val="18"/>
+              </w:rPr>
+              <w:t xml:space="preserve">6. Construir el flujo de pedido con cobro único del total confirmado (ADR-027), con los nueve casos obligatorios del flujo de pago en verde, al 12 de noviembre. Este objetivo cambió el 26 de octubre. Antes decía autorización diferida y captura por el monto real, pero la prueba de concepto de Transbank mostró que la captura diferida no admite débito. Con un solo cobro, además, la familia ve el monto exacto antes de pagar. Planificado para el sprint 4, del 6 al 12 de noviembre.</w:t>
+            </w:r>
+          </w:p>
+          <w:p>
+            <w:pPr>
+              <w:pStyle w:val="Prrafodelista"/>
+              <w:spacing w:after="80" w:before="0"/>
+              <w:ind w:left="0" w:firstLine="0"/>
+              <w:jc w:val="left"/>
+            </w:pPr>
+            <w:r>
+              <w:rPr>
+                <w:rFonts w:ascii="Calibri" w:hAnsi="Calibri" w:eastAsia="Calibri"/>
+                <w:color w:val="1A1A1A"/>
+                <w:sz w:val="18"/>
+              </w:rPr>
+              <w:t xml:space="preserve">7. Desplegar el sistema en un entorno de demostración con los seis recorridos críticos operativos y el pipeline de integración continua en verde, al 19 de noviembre. Planificado para el sprint 5, del 13 al 19 de noviembre. El pipeline ya corre en cada push, y el staging con HTTPS se construye en el sprint 3 (MATU-25).</w:t>
             </w:r>
           </w:p>
         </w:tc>
@@ -1697,17 +1570,7 @@
                 <w:color w:val="1A1A1A"/>
                 <w:sz w:val="18"/>
               </w:rPr>
-              <w:t xml:space="preserve">Los sprints de una semana con entregable verificable hacen visible un atraso en días y no en meses, en una ventana corta y con un equipo de dos personas sin dedicación completa. El reparto por ejes evita que una persona espere a la otra. La validación con criterios de falsación fijados de antemano permitió cambiar el producto con evidencia (ADR-023) antes de construirlo. Y el desarrollo asistido por IA, con la definición de terminado como control, permitió recuperar las tres semanas perdidas al inicio sin sacrificar la calidad. Separar en agentes distintos a quien construye y a quien verifica mantiene ese control cuando el código lo genera un asistente. </w:t>
-            </w:r>
-            <w:r>
-              <w:rPr>
-                <w:rFonts w:ascii="Calibri" w:hAnsi="Calibri" w:eastAsia="Calibri"/>
-                <w:b/>
-                <w:color w:val="1A1A1A"/>
-                <w:sz w:val="18"/>
-                <w:highlight w:val="yellow"/>
-              </w:rPr>
-              <w:t xml:space="preserve">[Completar con la velocidad real y el factor de vibecoding medidos en los sprints]</w:t>
+              <w:t xml:space="preserve">Los sprints de una semana con entregable verificable hacen visible un atraso en días y no en meses, en una ventana corta y con un equipo de dos personas sin dedicación completa. El reparto por ejes evita que una persona espere a la otra. La validación con criterios de falsación fijados de antemano permitió cambiar el producto con evidencia (ADR-023) antes de construirlo. Y el desarrollo asistido por IA, con la definición de terminado como control, permitió recuperar las tres semanas perdidas al inicio sin sacrificar la calidad. Separar en agentes distintos a quien construye y a quien verifica mantiene ese control cuando el código lo genera un asistente. Lo medido hasta ahora apoya esa decisión. En el sprint 1, Jorge completó en 6,4 horas reales historias estimadas en 12 (un factor cercano a 1,9). En la página del relevo del sprint 2, el factor fue cercano a 1,4. Son mínimos, porque las horas se toman de los commits y de los movimientos de las tarjetas, y todavía cubren solo una parte de las historias. El sprint 2 cerró las once historias comprometidas, que en el backlog original ocupaban dos sprints.</w:t>
             </w:r>
           </w:p>
         </w:tc>
@@ -1849,34 +1712,7 @@
                 <w:color w:val="1A1A1A"/>
                 <w:sz w:val="18"/>
               </w:rPr>
-              <w:t xml:space="preserve">– </w:t>
-            </w:r>
-            <w:r>
-              <w:rPr>
-                <w:rFonts w:ascii="Calibri" w:hAnsi="Calibri" w:eastAsia="Calibri"/>
-                <w:b/>
-                <w:color w:val="1A1A1A"/>
-                <w:sz w:val="18"/>
-              </w:rPr>
-              <w:t xml:space="preserve">Sprint 1 (16 a 22 de octubre).</w:t>
-            </w:r>
-            <w:r>
-              <w:rPr>
-                <w:rFonts w:ascii="Calibri" w:hAnsi="Calibri" w:eastAsia="Calibri"/>
-                <w:color w:val="1A1A1A"/>
-                <w:sz w:val="18"/>
-              </w:rPr>
-              <w:t xml:space="preserve"> Identidad, grupo familiar y alta de la persona cuidada con consentimiento. Cerrado. </w:t>
-            </w:r>
-            <w:r>
-              <w:rPr>
-                <w:rFonts w:ascii="Calibri" w:hAnsi="Calibri" w:eastAsia="Calibri"/>
-                <w:b/>
-                <w:color w:val="1A1A1A"/>
-                <w:sz w:val="18"/>
-                <w:highlight w:val="yellow"/>
-              </w:rPr>
-              <w:t xml:space="preserve">[Completar con el factor de vibecoding medido en el sprint 1]</w:t>
+              <w:t xml:space="preserve">– Sprint 1 (16 a 22 de octubre). Identidad, grupo familiar y alta de la persona cuidada con consentimiento. Cerrado el 25 de octubre con sus once tarjetas: crear cuenta, iniciar sesión con el token validado en cada petición, contexto de tenant, grupo familiar, alta con consentimiento, puertos con prueba de arquitectura, política de privacidad v0.9, figura legal del piloto y cierre de la prueba de concepto de Transbank.</w:t>
             </w:r>
           </w:p>
           <w:p>
@@ -1892,34 +1728,7 @@
                 <w:color w:val="1A1A1A"/>
                 <w:sz w:val="18"/>
               </w:rPr>
-              <w:t xml:space="preserve">– </w:t>
-            </w:r>
-            <w:r>
-              <w:rPr>
-                <w:rFonts w:ascii="Calibri" w:hAnsi="Calibri" w:eastAsia="Calibri"/>
-                <w:b/>
-                <w:color w:val="1A1A1A"/>
-                <w:sz w:val="18"/>
-              </w:rPr>
-              <w:t xml:space="preserve">Sprint 2 (23 a 29 de octubre).</w:t>
-            </w:r>
-            <w:r>
-              <w:rPr>
-                <w:rFonts w:ascii="Calibri" w:hAnsi="Calibri" w:eastAsia="Calibri"/>
-                <w:color w:val="1A1A1A"/>
-                <w:sz w:val="18"/>
-              </w:rPr>
-              <w:t xml:space="preserve"> Ficha de relevo y acceso de relevo. En curso, con cierre el 29 de octubre. Ya están acordados el contrato de API de la ficha y del relevo (MATU-09) y el diseño de sus pantallas, y se aprobó el ADR-027. </w:t>
-            </w:r>
-            <w:r>
-              <w:rPr>
-                <w:rFonts w:ascii="Calibri" w:hAnsi="Calibri" w:eastAsia="Calibri"/>
-                <w:b/>
-                <w:color w:val="1A1A1A"/>
-                <w:sz w:val="18"/>
-                <w:highlight w:val="yellow"/>
-              </w:rPr>
-              <w:t xml:space="preserve">[Resultado]</w:t>
+              <w:t xml:space="preserve">– Sprint 2 (23 a 29 de octubre). Ficha de relevo y acceso de relevo. Cerrado con todas sus historias en main: contrato de API (MATU-09), cifrado con clave por persona (MATU-11), ficha de tres campos (MATU-12), edición sin pisar lo que escribió otro (MATU-13), auditoría (MATU-14), compartir con un relevo (MATU-18), abrir como relevo con enlace y PIN (MATU-19), revocar el acceso (MATU-20), página web del relevo (MATU-23) y datos sintéticos de prueba (MATU-30). También se aplicó el ADR-027. La suite llegó a más de 830 pruebas en verde.</w:t>
             </w:r>
           </w:p>
           <w:p>
@@ -1935,34 +1744,7 @@
                 <w:color w:val="1A1A1A"/>
                 <w:sz w:val="18"/>
               </w:rPr>
-              <w:t xml:space="preserve">– </w:t>
-            </w:r>
-            <w:r>
-              <w:rPr>
-                <w:rFonts w:ascii="Calibri" w:hAnsi="Calibri" w:eastAsia="Calibri"/>
-                <w:b/>
-                <w:color w:val="1A1A1A"/>
-                <w:sz w:val="18"/>
-              </w:rPr>
-              <w:t xml:space="preserve">Demostración navegable (viernes 30 de octubre).</w:t>
-            </w:r>
-            <w:r>
-              <w:rPr>
-                <w:rFonts w:ascii="Calibri" w:hAnsi="Calibri" w:eastAsia="Calibri"/>
-                <w:color w:val="1A1A1A"/>
-                <w:sz w:val="18"/>
-              </w:rPr>
-              <w:t xml:space="preserve"> MATU como aplicación web mobile first, con datos sintéticos y precios de ejemplo. Recorre la ficha y el acceso de relevo, la lista de reposición y el pedido con cobro único. Lo que todavía no está construido se muestra simulado. </w:t>
-            </w:r>
-            <w:r>
-              <w:rPr>
-                <w:rFonts w:ascii="Calibri" w:hAnsi="Calibri" w:eastAsia="Calibri"/>
-                <w:b/>
-                <w:color w:val="1A1A1A"/>
-                <w:sz w:val="18"/>
-                <w:highlight w:val="yellow"/>
-              </w:rPr>
-              <w:t xml:space="preserve">[Resultado de la demostración]</w:t>
+              <w:t xml:space="preserve">– Demostración navegable (viernes 30 de octubre). Presentada junto con el avance de la Fase 2. MATU como aplicación web, con datos sintéticos y precios de ejemplo, recorre las tres capas: la ficha y el acceso de relevo, la lista de reposición y el pedido con cobro único. La cuenta, el grupo y el alta de la persona usan el backend real, y el resto se muestra simulado. Pasó la revisión de diseño y de QA, incluido el reflujo a 320 px con el texto al 200%.</w:t>
             </w:r>
           </w:p>
           <w:p>
@@ -1978,34 +1760,7 @@
                 <w:color w:val="1A1A1A"/>
                 <w:sz w:val="18"/>
               </w:rPr>
-              <w:t xml:space="preserve">– </w:t>
-            </w:r>
-            <w:r>
-              <w:rPr>
-                <w:rFonts w:ascii="Calibri" w:hAnsi="Calibri" w:eastAsia="Calibri"/>
-                <w:b/>
-                <w:color w:val="1A1A1A"/>
-                <w:sz w:val="18"/>
-              </w:rPr>
-              <w:t>Sprint 3 (30 de octubre a 5 de noviembre).</w:t>
-            </w:r>
-            <w:r>
-              <w:rPr>
-                <w:rFonts w:ascii="Calibri" w:hAnsi="Calibri" w:eastAsia="Calibri"/>
-                <w:color w:val="1A1A1A"/>
-                <w:sz w:val="18"/>
-              </w:rPr>
-              <w:t xml:space="preserve"> App de familia y perfil de consumo con predicción. </w:t>
-            </w:r>
-            <w:r>
-              <w:rPr>
-                <w:rFonts w:ascii="Calibri" w:hAnsi="Calibri" w:eastAsia="Calibri"/>
-                <w:b/>
-                <w:color w:val="1A1A1A"/>
-                <w:sz w:val="18"/>
-                <w:highlight w:val="yellow"/>
-              </w:rPr>
-              <w:t>[Resultado]</w:t>
+              <w:t xml:space="preserve">– Sprint 3 (30 de octubre a 5 de noviembre). En curso, con dieciséis tarjetas priorizadas (MATU-25 y MATU-32 a MATU-46): contrato de API de la app de familia, perfil de consumo y predicción de quiebre, app de familia, sesión con renovación del token, staging con HTTPS, avisos, primera ronda de usabilidad y cuatro entrevistas más para H5, H6 y H7.</w:t>
             </w:r>
           </w:p>
           <w:p>
@@ -2021,34 +1776,7 @@
                 <w:color w:val="1A1A1A"/>
                 <w:sz w:val="18"/>
               </w:rPr>
-              <w:t xml:space="preserve">– </w:t>
-            </w:r>
-            <w:r>
-              <w:rPr>
-                <w:rFonts w:ascii="Calibri" w:hAnsi="Calibri" w:eastAsia="Calibri"/>
-                <w:b/>
-                <w:color w:val="1A1A1A"/>
-                <w:sz w:val="18"/>
-              </w:rPr>
-              <w:t xml:space="preserve">Sprint 4 (6 a 12 de noviembre).</w:t>
-            </w:r>
-            <w:r>
-              <w:rPr>
-                <w:rFonts w:ascii="Calibri" w:hAnsi="Calibri" w:eastAsia="Calibri"/>
-                <w:color w:val="1A1A1A"/>
-                <w:sz w:val="18"/>
-              </w:rPr>
-              <w:t xml:space="preserve"> Catálogo con precios exactos, lista de reposición, pedido y pago con cobro único del total confirmado (ADR-027). </w:t>
-            </w:r>
-            <w:r>
-              <w:rPr>
-                <w:rFonts w:ascii="Calibri" w:hAnsi="Calibri" w:eastAsia="Calibri"/>
-                <w:b/>
-                <w:color w:val="1A1A1A"/>
-                <w:sz w:val="18"/>
-                <w:highlight w:val="yellow"/>
-              </w:rPr>
-              <w:t xml:space="preserve">[Resultado]</w:t>
+              <w:t xml:space="preserve">– Sprint 4 (6 a 12 de noviembre). Planificado: catálogo con precios exactos, lista de reposición exportable, pedido y pago con cobro único del total confirmado (ADR-027), vista de comercio, entorno de demostración y segunda ronda de usabilidad.</w:t>
             </w:r>
           </w:p>
           <w:p>
@@ -2064,34 +1792,7 @@
                 <w:color w:val="1A1A1A"/>
                 <w:sz w:val="18"/>
               </w:rPr>
-              <w:t xml:space="preserve">– </w:t>
-            </w:r>
-            <w:r>
-              <w:rPr>
-                <w:rFonts w:ascii="Calibri" w:hAnsi="Calibri" w:eastAsia="Calibri"/>
-                <w:b/>
-                <w:color w:val="1A1A1A"/>
-                <w:sz w:val="18"/>
-              </w:rPr>
-              <w:t>Sprint 5 (13 a 19 de noviembre).</w:t>
-            </w:r>
-            <w:r>
-              <w:rPr>
-                <w:rFonts w:ascii="Calibri" w:hAnsi="Calibri" w:eastAsia="Calibri"/>
-                <w:color w:val="1A1A1A"/>
-                <w:sz w:val="18"/>
-              </w:rPr>
-              <w:t xml:space="preserve"> Endurecimiento, despliegue y guion de demostración. </w:t>
-            </w:r>
-            <w:r>
-              <w:rPr>
-                <w:rFonts w:ascii="Calibri" w:hAnsi="Calibri" w:eastAsia="Calibri"/>
-                <w:b/>
-                <w:color w:val="1A1A1A"/>
-                <w:sz w:val="18"/>
-                <w:highlight w:val="yellow"/>
-              </w:rPr>
-              <w:t>[Resultado]</w:t>
+              <w:t xml:space="preserve">– Sprint 5 (13 a 19 de noviembre). Planificado: endurecimiento de seguridad, pruebas de carga, despliegue final, backoffice mínimo y guion de demostración. Su resultado se informa en la evidencia de la Fase 3.</w:t>
             </w:r>
           </w:p>
           <w:p>
@@ -2124,17 +1825,7 @@
                 <w:color w:val="1A1A1A"/>
                 <w:sz w:val="18"/>
               </w:rPr>
-              <w:t xml:space="preserve">El diseño cerrado antes de construir, el modelo de datos probado en SQL antes de tener API, el backlog con criterios de aceptación y el desarrollo asistido por IA. En los sprints se sumaron el trabajo con seis agentes de roles separados, la revisión cruzada de cada pull request y la investigación normativa hecha antes de construir el pago. </w:t>
-            </w:r>
-            <w:r>
-              <w:rPr>
-                <w:rFonts w:ascii="Calibri" w:hAnsi="Calibri" w:eastAsia="Calibri"/>
-                <w:b/>
-                <w:color w:val="1A1A1A"/>
-                <w:sz w:val="18"/>
-                <w:highlight w:val="yellow"/>
-              </w:rPr>
-              <w:t xml:space="preserve">[Agregar los que aparezcan en los sprints 3 a 5]</w:t>
+              <w:t xml:space="preserve">El diseño cerrado antes de construir, el modelo de datos probado en SQL antes de tener API, el backlog con criterios de aceptación y el desarrollo asistido por IA. En los sprints se sumaron el trabajo con seis agentes de roles separados, la revisión cruzada de cada pull request y la investigación normativa hecha antes de construir el pago. Y el stack de la demostración, que se reutilizó: la página del relevo se construyó con él y se convirtió en la primera ruta de la aplicación definitiva.</w:t>
             </w:r>
           </w:p>
           <w:p>
@@ -2167,17 +1858,7 @@
                 <w:color w:val="1A1A1A"/>
                 <w:sz w:val="18"/>
               </w:rPr>
-              <w:t xml:space="preserve">El desarrollo empezó tres semanas tarde, mientras se acordaba el entorno con el docente. Jorge redujo su disponibilidad por la práctica profesional desde el 1 de octubre. La prueba de concepto de Transbank quedó incompleta en el sprint 0 y mostró que el débito no admite captura diferida. Como el débito es el medio mayoritario del segmento, hubo que rediseñar el cobro (ADR-027). </w:t>
-            </w:r>
-            <w:r>
-              <w:rPr>
-                <w:rFonts w:ascii="Calibri" w:hAnsi="Calibri" w:eastAsia="Calibri"/>
-                <w:b/>
-                <w:color w:val="1A1A1A"/>
-                <w:sz w:val="18"/>
-                <w:highlight w:val="yellow"/>
-              </w:rPr>
-              <w:t xml:space="preserve">[Agregar las de los sprints]</w:t>
+              <w:t xml:space="preserve">El desarrollo empezó tres semanas tarde, mientras se acordaba el entorno con el docente. Jorge redujo su disponibilidad por la práctica profesional desde el 1 de octubre. La prueba de concepto de Transbank quedó incompleta en el sprint 0 y mostró que el débito no admite captura diferida. Como el débito es el medio mayoritario del segmento, hubo que rediseñar el cobro (ADR-027). En los sprints 1 y 2 hubo días en que una persona no pudo trabajar, y algunas fusiones se hicieron con una excepción autorizada y escrita a la regla de que nadie fusiona su propio trabajo. La rama main tampoco tenía protección, así que esa regla dependía solo de la disciplina del equipo. Se corrige en el sprint 3 (MATU-33).</w:t>
             </w:r>
           </w:p>
           <w:p>
@@ -2349,18 +2030,48 @@
             <w:pPr>
               <w:pStyle w:val="Prrafodelista"/>
               <w:spacing w:after="80" w:before="0"/>
-              <w:ind w:left="0" w:firstLine="0"/>
-              <w:jc w:val="left"/>
-            </w:pPr>
-            <w:r>
-              <w:rPr>
-                <w:rFonts w:ascii="Calibri" w:hAnsi="Calibri" w:eastAsia="Calibri"/>
-                <w:b/>
-                <w:color w:val="1A1A1A"/>
-                <w:sz w:val="18"/>
-                <w:highlight w:val="yellow"/>
-              </w:rPr>
-              <w:t xml:space="preserve">[Agregar los ajustes de los sprints 3 a 5]</w:t>
+              <w:ind w:left="200" w:hanging="160"/>
+              <w:jc w:val="left"/>
+            </w:pPr>
+            <w:r>
+              <w:rPr>
+                <w:rFonts w:ascii="Calibri" w:hAnsi="Calibri" w:eastAsia="Calibri"/>
+                <w:color w:val="1A1A1A"/>
+                <w:sz w:val="18"/>
+              </w:rPr>
+              <w:t xml:space="preserve">– Consentimiento inalterable (28 de octubre). El consentimiento no se edita: la revocación y la confirmación anual se registran como filas nuevas, para conservar la prueba de qué se autorizó y cuándo.</w:t>
+            </w:r>
+          </w:p>
+          <w:p>
+            <w:pPr>
+              <w:pStyle w:val="Prrafodelista"/>
+              <w:spacing w:after="80" w:before="0"/>
+              <w:ind w:left="200" w:hanging="160"/>
+              <w:jc w:val="left"/>
+            </w:pPr>
+            <w:r>
+              <w:rPr>
+                <w:rFonts w:ascii="Calibri" w:hAnsi="Calibri" w:eastAsia="Calibri"/>
+                <w:color w:val="1A1A1A"/>
+                <w:sz w:val="18"/>
+              </w:rPr>
+              <w:t xml:space="preserve">– Clave maestra en variable de entorno durante el semestre (28 de octubre). Es un desvío declarado del ADR-016, válido solo con datos sintéticos: la API no arranca así en un entorno de producción. La custodia de la clave y su rotación son requisito antes de operar con datos reales.</w:t>
+            </w:r>
+          </w:p>
+          <w:p>
+            <w:pPr>
+              <w:pStyle w:val="Prrafodelista"/>
+              <w:spacing w:after="80" w:before="0"/>
+              <w:ind w:left="200" w:hanging="160"/>
+              <w:jc w:val="left"/>
+            </w:pPr>
+            <w:r>
+              <w:rPr>
+                <w:rFonts w:ascii="Calibri" w:hAnsi="Calibri" w:eastAsia="Calibri"/>
+                <w:color w:val="1A1A1A"/>
+                <w:sz w:val="18"/>
+              </w:rPr>
+              <w:t xml:space="preserve">– Sprint 3 priorizado para un inicio escalonado (31 de octubre). Martín empieza dos días antes que Jorge, así que el contrato de API de la app de familia va primero y las tareas se ordenaron para que ninguno espere al otro.</w:t>
             </w:r>
           </w:p>
         </w:tc>
@@ -2564,17 +2275,7 @@
                 <w:color w:val="1A1A1A"/>
                 <w:sz w:val="18"/>
               </w:rPr>
-              <w:t xml:space="preserve">– Especificación de diseño y demostración navegable del 30 de octubre (MATU_PROYECTO, Demo/). </w:t>
-            </w:r>
-            <w:r>
-              <w:rPr>
-                <w:rFonts w:ascii="Calibri" w:hAnsi="Calibri" w:eastAsia="Calibri"/>
-                <w:b/>
-                <w:color w:val="1A1A1A"/>
-                <w:sz w:val="18"/>
-                <w:highlight w:val="yellow"/>
-              </w:rPr>
-              <w:t xml:space="preserve">[Enlace y capturas después de la demostración]</w:t>
+              <w:t xml:space="preserve">– Especificación de diseño y demostración navegable presentada el 30 de octubre (MATU_PROYECTO, Demo/). Las instrucciones para ejecutarla están en MATU, Fase 2/Evidencias Proyecto/README.md.</w:t>
             </w:r>
           </w:p>
           <w:p>
@@ -2591,7 +2292,7 @@
                 <w:color w:val="1F3864"/>
                 <w:sz w:val="18"/>
               </w:rPr>
-              <w:t>Evidencias finales</w:t>
+              <w:t xml:space="preserve">Evidencias al cierre de la Fase 2</w:t>
             </w:r>
           </w:p>
           <w:p>
@@ -2607,17 +2308,7 @@
                 <w:color w:val="1A1A1A"/>
                 <w:sz w:val="18"/>
               </w:rPr>
-              <w:t xml:space="preserve">– Aplicación web mobile first en operación: app de familia, vista de relevo, vista de comercio y backoffice en el entorno de demostración. </w:t>
-            </w:r>
-            <w:r>
-              <w:rPr>
-                <w:rFonts w:ascii="Calibri" w:hAnsi="Calibri" w:eastAsia="Calibri"/>
-                <w:b/>
-                <w:color w:val="1A1A1A"/>
-                <w:sz w:val="18"/>
-                <w:highlight w:val="yellow"/>
-              </w:rPr>
-              <w:t xml:space="preserve">[Enlace y capturas]</w:t>
+              <w:t xml:space="preserve">– Ficha de relevo y acceso de relevo operativos en la API, con más de 830 pruebas e integración continua en verde, y la página web del relevo, primera ruta de la aplicación definitiva (MATU_PROYECTO, backend/ y web/).</w:t>
             </w:r>
           </w:p>
           <w:p>
@@ -2633,17 +2324,7 @@
                 <w:color w:val="1A1A1A"/>
                 <w:sz w:val="18"/>
               </w:rPr>
-              <w:t xml:space="preserve">– Resultados de las pruebas de usabilidad. </w:t>
-            </w:r>
-            <w:r>
-              <w:rPr>
-                <w:rFonts w:ascii="Calibri" w:hAnsi="Calibri" w:eastAsia="Calibri"/>
-                <w:b/>
-                <w:color w:val="1A1A1A"/>
-                <w:sz w:val="18"/>
-                <w:highlight w:val="yellow"/>
-              </w:rPr>
-              <w:t>[Completar]</w:t>
+              <w:t xml:space="preserve">– Presentación de avance del 30 de octubre (MATU, Fase 2/Evidencias Proyecto).</w:t>
             </w:r>
           </w:p>
           <w:p>
@@ -2659,17 +2340,7 @@
                 <w:color w:val="1A1A1A"/>
                 <w:sz w:val="18"/>
               </w:rPr>
-              <w:t xml:space="preserve">– Guion de demostración y video del recorrido principal. </w:t>
-            </w:r>
-            <w:r>
-              <w:rPr>
-                <w:rFonts w:ascii="Calibri" w:hAnsi="Calibri" w:eastAsia="Calibri"/>
-                <w:b/>
-                <w:color w:val="1A1A1A"/>
-                <w:sz w:val="18"/>
-                <w:highlight w:val="yellow"/>
-              </w:rPr>
-              <w:t>[Completar]</w:t>
+              <w:t xml:space="preserve">– El entorno de demostración, los resultados de usabilidad y el video del recorrido principal se entregan con la evidencia de la Fase 3.</w:t>
             </w:r>
           </w:p>
           <w:p>
@@ -2685,7 +2356,7 @@
                 <w:color w:val="1A1A1A"/>
                 <w:sz w:val="18"/>
               </w:rPr>
-              <w:t>– Informe final y presentación de la defensa.</w:t>
+              <w:t xml:space="preserve">– Informe final de la Fase 2 (este documento).</w:t>
             </w:r>
           </w:p>
         </w:tc>
@@ -2799,17 +2470,7 @@
                 <w:color w:val="1A1A1A"/>
                 <w:sz w:val="18"/>
               </w:rPr>
-              <w:t xml:space="preserve">Mi interés está en la salud abordada desde la informática, con foco en la gestión de proyectos y el trabajo con datos. MATU confirmó ese interés y le agregó algo que no esperaba: el cumplimiento normativo y la protección de datos sensibles no son un trámite al final, son decisiones de diseño que condicionan el modelo de datos desde el principio. En el semestre trabajé deliberadamente mi punto más débil, el desarrollo de software de extremo a extremo. </w:t>
-            </w:r>
-            <w:r>
-              <w:rPr>
-                <w:rFonts w:ascii="Calibri" w:hAnsi="Calibri" w:eastAsia="Calibri"/>
-                <w:b/>
-                <w:color w:val="1A1A1A"/>
-                <w:sz w:val="18"/>
-                <w:highlight w:val="yellow"/>
-              </w:rPr>
-              <w:t>[Completar al cierre: qué intereses se confirmaron, cuáles cambiaron y cómo me proyecto laboralmente]</w:t>
+              <w:t xml:space="preserve">Mi interés está en la salud abordada desde la informática, con foco en la gestión de proyectos y el trabajo con datos. MATU confirmó ese interés y le agregó algo que no esperaba: el cumplimiento normativo y la protección de datos sensibles no son un trámite al final, son decisiones de diseño que condicionan el modelo de datos desde el principio. En el semestre trabajé deliberadamente mi punto más débil, el desarrollo de software de extremo a extremo. Se confirmó que lo que más me motiva es ordenar el trabajo y las decisiones: priorizar, escribir criterios de aceptación y decidir qué no se construye. Me proyecto en roles de producto o de gestión de proyectos tecnológicos en salud, donde la protección de datos y el diseño para personas mayores sean parte del trabajo.</w:t>
             </w:r>
           </w:p>
           <w:p>
@@ -2842,17 +2503,7 @@
                 <w:color w:val="1A1A1A"/>
                 <w:sz w:val="18"/>
               </w:rPr>
-              <w:t xml:space="preserve">Mi interés se centra en la dirección ágil de proyectos tecnológicos y en emprendimientos de los sectores Healthtech y Fintech. En MATU ejercí el rol de Scrum Master y llevé el eje de identidad, dinero y operación. </w:t>
-            </w:r>
-            <w:r>
-              <w:rPr>
-                <w:rFonts w:ascii="Calibri" w:hAnsi="Calibri" w:eastAsia="Calibri"/>
-                <w:b/>
-                <w:color w:val="1A1A1A"/>
-                <w:sz w:val="18"/>
-                <w:highlight w:val="yellow"/>
-              </w:rPr>
-              <w:t>[Martín completa al cierre: qué intereses se confirmaron, cuáles cambiaron y cómo se proyecta laboralmente]</w:t>
+              <w:t xml:space="preserve">Mi interés se centra en la dirección ágil de proyectos tecnológicos y en emprendimientos de los sectores Healthtech y Fintech. En MATU ejercí el rol de Scrum Master y llevé el eje de identidad, dinero y operación. Me tocó lo que sostiene la operación: la identidad, el pipeline de integración continua, la integración con Transbank y el acceso del relevo, desde la API hasta la página que lo abre. Se confirmó mi interés por la dirección ágil: con un equipo de dos personas y seis agentes de IA, el proceso de revisión importó tanto como el código. Me proyecto en roles de liderazgo ágil en proyectos Healthtech y Fintech.</w:t>
             </w:r>
           </w:p>
         </w:tc>

</xml_diff>